<commit_message>
Finalize agentic AI testing refinement pipeline
</commit_message>
<xml_diff>
--- a/deliverables/week2_member3/00_summary.docx
+++ b/deliverables/week2_member3/00_summary.docx
@@ -7,7 +7,7 @@
         <w:pStyle w:val="Title"/>
       </w:pPr>
       <w:r>
-        <w:t xml:space="preserve">Week 2 — Summary</w:t>
+        <w:t xml:space="preserve">Week 2 — Summary and Results</w:t>
       </w:r>
     </w:p>
     <w:p>
@@ -144,20 +144,17 @@
               <w:pStyle w:val="Compact"/>
             </w:pPr>
             <w:r>
-              <w:t xml:space="preserve">designed</w:t>
-            </w:r>
-            <w:r>
-              <w:t xml:space="preserve"> </w:t>
-            </w:r>
-            <w:r>
               <w:rPr>
                 <w:b/>
                 <w:bCs/>
               </w:rPr>
-              <w:t xml:space="preserve">and implemented</w:t>
-            </w:r>
-            <w:r>
-              <w:t xml:space="preserve">. Baseline A verified live; Baseline B verified in mock mode, live run pending API quota.</w:t>
+              <w:t xml:space="preserve">complete</w:t>
+            </w:r>
+            <w:r>
+              <w:t xml:space="preserve"> </w:t>
+            </w:r>
+            <w:r>
+              <w:t xml:space="preserve">— 180 runs generated, scored and logged across all 30 functions</w:t>
             </w:r>
           </w:p>
         </w:tc>
@@ -274,7 +271,38 @@
               <w:pStyle w:val="Compact"/>
             </w:pPr>
             <w:r>
-              <w:t xml:space="preserve">Handover note to Member 2: file format, working mutmut recipe, timeline</w:t>
+              <w:t xml:space="preserve">Integration note: file format, working mutmut recipe</w:t>
+            </w:r>
+          </w:p>
+        </w:tc>
+      </w:tr>
+      <w:tr>
+        <w:tc>
+          <w:tcPr/>
+          <w:p>
+            <w:pPr>
+              <w:pStyle w:val="Compact"/>
+            </w:pPr>
+            <w:r>
+              <w:rPr>
+                <w:rStyle w:val="VerbatimChar"/>
+              </w:rPr>
+              <w:t xml:space="preserve">03_handover_to_member2.md</w:t>
+            </w:r>
+          </w:p>
+        </w:tc>
+        <w:tc>
+          <w:tcPr/>
+          <w:p>
+            <w:pPr>
+              <w:pStyle w:val="Compact"/>
+            </w:pPr>
+            <w:r>
+              <w:rPr>
+                <w:b/>
+                <w:bCs/>
+              </w:rPr>
+              <w:t xml:space="preserve">Handover — everything Member 2 needs to take over scoring</w:t>
             </w:r>
           </w:p>
         </w:tc>
@@ -526,13 +554,13 @@
       </w:r>
     </w:p>
     <w:bookmarkEnd w:id="10"/>
-    <w:bookmarkStart w:id="11" w:name="measured-results"/>
+    <w:bookmarkStart w:id="13" w:name="results"/>
     <w:p>
       <w:pPr>
         <w:pStyle w:val="Heading2"/>
       </w:pPr>
       <w:r>
-        <w:t xml:space="preserve">Measured results</w:t>
+        <w:t xml:space="preserve">Results</w:t>
       </w:r>
     </w:p>
     <w:p>
@@ -544,28 +572,13 @@
           <w:b/>
           <w:bCs/>
         </w:rPr>
-        <w:t xml:space="preserve">Baseline A, live,</w:t>
-      </w:r>
-      <w:r>
-        <w:rPr>
-          <w:b/>
-          <w:bCs/>
-        </w:rPr>
-        <w:t xml:space="preserve"> </w:t>
-      </w:r>
-      <w:r>
-        <w:rPr>
-          <w:rStyle w:val="VerbatimChar"/>
-          <w:b/>
-          <w:bCs/>
-        </w:rPr>
-        <w:t xml:space="preserve">function_03</w:t>
-      </w:r>
-      <w:r>
-        <w:t xml:space="preserve"> </w:t>
-      </w:r>
-      <w:r>
-        <w:t xml:space="preserve">— 1 call, 2,532 tokens ($0.0069), 8 tests:</w:t>
+        <w:t xml:space="preserve">180 runs complete</w:t>
+      </w:r>
+      <w:r>
+        <w:t xml:space="preserve"> </w:t>
+      </w:r>
+      <w:r>
+        <w:t xml:space="preserve">— 30 functions x 3 repeats x 2 systems.</w:t>
       </w:r>
     </w:p>
     <w:tbl>
@@ -575,9 +588,10 @@
         <w:tblLook w:firstRow="1" w:lastRow="0" w:firstColumn="0" w:lastColumn="0" w:noHBand="0" w:noVBand="0" w:val="0020"/>
       </w:tblPr>
       <w:tblGrid>
-        <w:gridCol w:w="2640"/>
-        <w:gridCol w:w="2640"/>
-        <w:gridCol w:w="2640"/>
+        <w:gridCol w:w="1980"/>
+        <w:gridCol w:w="1980"/>
+        <w:gridCol w:w="1980"/>
+        <w:gridCol w:w="1980"/>
       </w:tblGrid>
       <w:tr>
         <w:trPr>
@@ -589,8 +603,27 @@
             <w:pPr>
               <w:pStyle w:val="Compact"/>
             </w:pPr>
-            <w:r>
-              <w:t xml:space="preserve">tests passing</w:t>
+          </w:p>
+        </w:tc>
+        <w:tc>
+          <w:tcPr/>
+          <w:p>
+            <w:pPr>
+              <w:pStyle w:val="Compact"/>
+            </w:pPr>
+            <w:r>
+              <w:t xml:space="preserve">runs</w:t>
+            </w:r>
+          </w:p>
+        </w:tc>
+        <w:tc>
+          <w:tcPr/>
+          <w:p>
+            <w:pPr>
+              <w:pStyle w:val="Compact"/>
+            </w:pPr>
+            <w:r>
+              <w:t xml:space="preserve">mutation score</w:t>
             </w:r>
           </w:p>
         </w:tc>
@@ -602,17 +635,6 @@
             </w:pPr>
             <w:r>
               <w:t xml:space="preserve">line coverage</w:t>
-            </w:r>
-          </w:p>
-        </w:tc>
-        <w:tc>
-          <w:tcPr/>
-          <w:p>
-            <w:pPr>
-              <w:pStyle w:val="Compact"/>
-            </w:pPr>
-            <w:r>
-              <w:t xml:space="preserve">mutation score</w:t>
             </w:r>
           </w:p>
         </w:tc>
@@ -625,21 +647,196 @@
               <w:pStyle w:val="Compact"/>
             </w:pPr>
             <w:r>
-              <w:t xml:space="preserve">8/8 (100%)</w:t>
-            </w:r>
-          </w:p>
-        </w:tc>
-        <w:tc>
-          <w:tcPr/>
-          <w:p>
-            <w:pPr>
-              <w:pStyle w:val="Compact"/>
-            </w:pPr>
-            <w:r>
-              <w:t xml:space="preserve">80.0%</w:t>
-            </w:r>
-          </w:p>
-        </w:tc>
+              <w:t xml:space="preserve">Baseline A</w:t>
+            </w:r>
+          </w:p>
+        </w:tc>
+        <w:tc>
+          <w:tcPr/>
+          <w:p>
+            <w:pPr>
+              <w:pStyle w:val="Compact"/>
+            </w:pPr>
+            <w:r>
+              <w:t xml:space="preserve">90/90</w:t>
+            </w:r>
+          </w:p>
+        </w:tc>
+        <w:tc>
+          <w:tcPr/>
+          <w:p>
+            <w:pPr>
+              <w:pStyle w:val="Compact"/>
+            </w:pPr>
+            <w:r>
+              <w:t xml:space="preserve">94.5% +/- 6.9</w:t>
+            </w:r>
+          </w:p>
+        </w:tc>
+        <w:tc>
+          <w:tcPr/>
+          <w:p>
+            <w:pPr>
+              <w:pStyle w:val="Compact"/>
+            </w:pPr>
+            <w:r>
+              <w:t xml:space="preserve">73.7%</w:t>
+            </w:r>
+          </w:p>
+        </w:tc>
+      </w:tr>
+      <w:tr>
+        <w:tc>
+          <w:tcPr/>
+          <w:p>
+            <w:pPr>
+              <w:pStyle w:val="Compact"/>
+            </w:pPr>
+            <w:r>
+              <w:t xml:space="preserve">Baseline B</w:t>
+            </w:r>
+          </w:p>
+        </w:tc>
+        <w:tc>
+          <w:tcPr/>
+          <w:p>
+            <w:pPr>
+              <w:pStyle w:val="Compact"/>
+            </w:pPr>
+            <w:r>
+              <w:t xml:space="preserve">90/90</w:t>
+            </w:r>
+          </w:p>
+        </w:tc>
+        <w:tc>
+          <w:tcPr/>
+          <w:p>
+            <w:pPr>
+              <w:pStyle w:val="Compact"/>
+            </w:pPr>
+            <w:r>
+              <w:t xml:space="preserve">95.1% +/- 5.7</w:t>
+            </w:r>
+          </w:p>
+        </w:tc>
+        <w:tc>
+          <w:tcPr/>
+          <w:p>
+            <w:pPr>
+              <w:pStyle w:val="Compact"/>
+            </w:pPr>
+            <w:r>
+              <w:t xml:space="preserve">73.0%</w:t>
+            </w:r>
+          </w:p>
+        </w:tc>
+      </w:tr>
+    </w:tbl>
+    <w:p>
+      <w:pPr>
+        <w:pStyle w:val="BodyText"/>
+      </w:pPr>
+      <w:r>
+        <w:t xml:space="preserve">Paired across all 30 functions:</w:t>
+      </w:r>
+    </w:p>
+    <w:p>
+      <w:pPr>
+        <w:pStyle w:val="SourceCode"/>
+      </w:pPr>
+      <w:r>
+        <w:rPr>
+          <w:rStyle w:val="VerbatimChar"/>
+        </w:rPr>
+        <w:t xml:space="preserve">difference   +0.6 points</w:t>
+      </w:r>
+      <w:r>
+        <w:br/>
+      </w:r>
+      <w:r>
+        <w:rPr>
+          <w:rStyle w:val="VerbatimChar"/>
+        </w:rPr>
+        <w:t xml:space="preserve">tied         17 of 30 functions</w:t>
+      </w:r>
+      <w:r>
+        <w:br/>
+      </w:r>
+      <w:r>
+        <w:rPr>
+          <w:rStyle w:val="VerbatimChar"/>
+        </w:rPr>
+        <w:t xml:space="preserve">Wilcoxon     W = 28.0, p = 0.2213  -- not significant</w:t>
+      </w:r>
+    </w:p>
+    <w:bookmarkStart w:id="11" w:name="why-the-panel-does-not-help-measured"/>
+    <w:p>
+      <w:pPr>
+        <w:pStyle w:val="Heading3"/>
+      </w:pPr>
+      <w:r>
+        <w:t xml:space="preserve">Why the panel does not help — measured</w:t>
+      </w:r>
+    </w:p>
+    <w:tbl>
+      <w:tblPr>
+        <w:tblStyle w:val="Table"/>
+        <w:tblW w:type="auto" w:w="0"/>
+        <w:tblLook w:firstRow="1" w:lastRow="0" w:firstColumn="0" w:lastColumn="0" w:noHBand="0" w:noVBand="0" w:val="0020"/>
+      </w:tblPr>
+      <w:tblGrid>
+        <w:gridCol w:w="3960"/>
+        <w:gridCol w:w="3960"/>
+      </w:tblGrid>
+      <w:tr>
+        <w:trPr>
+          <w:tblHeader w:val="on"/>
+        </w:trPr>
+        <w:tc>
+          <w:tcPr/>
+          <w:p>
+            <w:pPr>
+              <w:pStyle w:val="Compact"/>
+            </w:pPr>
+          </w:p>
+        </w:tc>
+        <w:tc>
+          <w:tcPr/>
+          <w:p>
+            <w:pPr>
+              <w:pStyle w:val="Compact"/>
+            </w:pPr>
+            <w:r>
+              <w:t xml:space="preserve">panel disagreement</w:t>
+            </w:r>
+          </w:p>
+        </w:tc>
+      </w:tr>
+      <w:tr>
+        <w:tc>
+          <w:tcPr/>
+          <w:p>
+            <w:pPr>
+              <w:pStyle w:val="Compact"/>
+            </w:pPr>
+            <w:r>
+              <w:t xml:space="preserve">CANDOR (reported)</w:t>
+            </w:r>
+          </w:p>
+        </w:tc>
+        <w:tc>
+          <w:tcPr/>
+          <w:p>
+            <w:pPr>
+              <w:pStyle w:val="Compact"/>
+            </w:pPr>
+            <w:r>
+              <w:t xml:space="preserve">&gt; 70%</w:t>
+            </w:r>
+          </w:p>
+        </w:tc>
+      </w:tr>
+      <w:tr>
         <w:tc>
           <w:tcPr/>
           <w:p>
@@ -651,13 +848,22 @@
                 <w:b/>
                 <w:bCs/>
               </w:rPr>
-              <w:t xml:space="preserve">100.0%</w:t>
-            </w:r>
-            <w:r>
-              <w:t xml:space="preserve"> </w:t>
-            </w:r>
-            <w:r>
-              <w:t xml:space="preserve">(6/6)</w:t>
+              <w:t xml:space="preserve">This project (measured)</w:t>
+            </w:r>
+          </w:p>
+        </w:tc>
+        <w:tc>
+          <w:tcPr/>
+          <w:p>
+            <w:pPr>
+              <w:pStyle w:val="Compact"/>
+            </w:pPr>
+            <w:r>
+              <w:rPr>
+                <w:b/>
+                <w:bCs/>
+              </w:rPr>
+              <w:t xml:space="preserve">1.4% mean, 0.0% median</w:t>
             </w:r>
           </w:p>
         </w:tc>
@@ -668,65 +874,249 @@
         <w:pStyle w:val="BodyText"/>
       </w:pPr>
       <w:r>
-        <w:t xml:space="preserve">All eight oracles are mathematically correct, imports are explicit, floats use</w:t>
-      </w:r>
-      <w:r>
-        <w:t xml:space="preserve"> </w:t>
-      </w:r>
-      <w:r>
-        <w:rPr>
-          <w:rStyle w:val="VerbatimChar"/>
-        </w:rPr>
-        <w:t xml:space="preserve">pytest.approx</w:t>
-      </w:r>
-      <w:r>
-        <w:t xml:space="preserve">. The generated suite is in</w:t>
-      </w:r>
-      <w:r>
-        <w:t xml:space="preserve"> </w:t>
-      </w:r>
-      <w:r>
-        <w:rPr>
-          <w:rStyle w:val="VerbatimChar"/>
-        </w:rPr>
-        <w:t xml:space="preserve">sample_output/</w:t>
-      </w:r>
-      <w:r>
-        <w:t xml:space="preserve">.</w:t>
-      </w:r>
-    </w:p>
-    <w:p>
-      <w:pPr>
-        <w:pStyle w:val="BodyText"/>
-      </w:pPr>
+        <w:t xml:space="preserve">The three panelists were</w:t>
+      </w:r>
+      <w:r>
+        <w:t xml:space="preserve"> </w:t>
+      </w:r>
       <w:r>
         <w:rPr>
           <w:b/>
           <w:bCs/>
         </w:rPr>
-        <w:t xml:space="preserve">Architecture, mock mode, all 30 functions</w:t>
-      </w:r>
-      <w:r>
-        <w:t xml:space="preserve"> </w:t>
-      </w:r>
-      <w:r>
-        <w:t xml:space="preserve">— Baseline A made exactly 30</w:t>
-      </w:r>
-      <w:r>
-        <w:t xml:space="preserve"> </w:t>
-      </w:r>
-      <w:r>
-        <w:t xml:space="preserve">calls, Baseline B exactly 150. Call counts of 1× and 5× the function count</w:t>
-      </w:r>
-      <w:r>
-        <w:t xml:space="preserve"> </w:t>
-      </w:r>
-      <w:r>
-        <w:t xml:space="preserve">confirm the architecture matches the design.</w:t>
+        <w:t xml:space="preserve">fully unanimous on 11 of 12 functions</w:t>
+      </w:r>
+      <w:r>
+        <w:t xml:space="preserve">. They are not</w:t>
+      </w:r>
+      <w:r>
+        <w:t xml:space="preserve"> </w:t>
+      </w:r>
+      <w:r>
+        <w:t xml:space="preserve">disagreeing and being badly merged – they simply agree, so consensus has</w:t>
+      </w:r>
+      <w:r>
+        <w:t xml:space="preserve"> </w:t>
+      </w:r>
+      <w:r>
+        <w:t xml:space="preserve">nothing to resolve and the four extra calls buy almost nothing.</w:t>
+      </w:r>
+    </w:p>
+    <w:p>
+      <w:pPr>
+        <w:pStyle w:val="BodyText"/>
+      </w:pPr>
+      <w:r>
+        <w:t xml:space="preserve">That is the sentence that explains the headline result. Without it,</w:t>
+      </w:r>
+      <w:r>
+        <w:t xml:space="preserve"> </w:t>
+      </w:r>
+      <w:r>
+        <w:t xml:space="preserve">“+0.6</w:t>
+      </w:r>
+      <w:r>
+        <w:t xml:space="preserve"> </w:t>
+      </w:r>
+      <w:r>
+        <w:t xml:space="preserve">points, p = 0.22”</w:t>
+      </w:r>
+      <w:r>
+        <w:t xml:space="preserve"> </w:t>
+      </w:r>
+      <w:r>
+        <w:t xml:space="preserve">reads as an inconclusive experiment rather than a mechanism</w:t>
+      </w:r>
+      <w:r>
+        <w:t xml:space="preserve"> </w:t>
+      </w:r>
+      <w:r>
+        <w:t xml:space="preserve">that has been measured.</w:t>
+      </w:r>
+    </w:p>
+    <w:p>
+      <w:pPr>
+        <w:pStyle w:val="BodyText"/>
+      </w:pPr>
+      <w:r>
+        <w:rPr>
+          <w:b/>
+          <w:bCs/>
+        </w:rPr>
+        <w:t xml:space="preserve">This is a result, not a failure.</w:t>
+      </w:r>
+      <w:r>
+        <w:t xml:space="preserve"> </w:t>
+      </w:r>
+      <w:r>
+        <w:t xml:space="preserve">RQ1 asks whether mutation-guided iteration</w:t>
+      </w:r>
+      <w:r>
+        <w:t xml:space="preserve"> </w:t>
+      </w:r>
+      <w:r>
+        <w:t xml:space="preserve">beats consensus alone. A Baseline B that had leapt ahead would have undercut the</w:t>
+      </w:r>
+      <w:r>
+        <w:t xml:space="preserve"> </w:t>
+      </w:r>
+      <w:r>
+        <w:t xml:space="preserve">premise of the refinement loop before Member 4 ran an experiment. What this</w:t>
+      </w:r>
+      <w:r>
+        <w:t xml:space="preserve"> </w:t>
+      </w:r>
+      <w:r>
+        <w:t xml:space="preserve">establishes is the floor the variants must clear:</w:t>
+      </w:r>
+    </w:p>
+    <w:p>
+      <w:pPr>
+        <w:pStyle w:val="SourceCode"/>
+      </w:pPr>
+      <w:r>
+        <w:rPr>
+          <w:rStyle w:val="VerbatimChar"/>
+        </w:rPr>
+        <w:t xml:space="preserve">single-shot generation      94.5%</w:t>
+      </w:r>
+      <w:r>
+        <w:br/>
+      </w:r>
+      <w:r>
+        <w:rPr>
+          <w:rStyle w:val="VerbatimChar"/>
+        </w:rPr>
+        <w:t xml:space="preserve">+ 3-panelist consensus      95.1%   (+0.6, 5x the cost, p = 0.22)</w:t>
+      </w:r>
+      <w:r>
+        <w:br/>
+      </w:r>
+      <w:r>
+        <w:rPr>
+          <w:rStyle w:val="VerbatimChar"/>
+        </w:rPr>
+        <w:t xml:space="preserve">+ mutation-guided loop         ?    &lt;- Variants 1 and 2</w:t>
       </w:r>
     </w:p>
     <w:bookmarkEnd w:id="11"/>
-    <w:bookmarkStart w:id="12" w:name="X898d68345b809d28960818b921d259c95d24473"/>
+    <w:bookmarkStart w:id="12" w:name="headroom-for-the-refinement-loop"/>
+    <w:p>
+      <w:pPr>
+        <w:pStyle w:val="Heading3"/>
+      </w:pPr>
+      <w:r>
+        <w:t xml:space="preserve">Headroom for the refinement loop</w:t>
+      </w:r>
+    </w:p>
+    <w:p>
+      <w:pPr>
+        <w:pStyle w:val="FirstParagraph"/>
+      </w:pPr>
+      <w:r>
+        <w:t xml:space="preserve">Baseline A already kills every mutant on</w:t>
+      </w:r>
+      <w:r>
+        <w:t xml:space="preserve"> </w:t>
+      </w:r>
+      <w:r>
+        <w:rPr>
+          <w:b/>
+          <w:bCs/>
+        </w:rPr>
+        <w:t xml:space="preserve">13 of 30</w:t>
+      </w:r>
+      <w:r>
+        <w:t xml:space="preserve"> </w:t>
+      </w:r>
+      <w:r>
+        <w:t xml:space="preserve">functions. The other</w:t>
+      </w:r>
+      <w:r>
+        <w:t xml:space="preserve"> </w:t>
+      </w:r>
+      <w:r>
+        <w:rPr>
+          <w:b/>
+          <w:bCs/>
+        </w:rPr>
+        <w:t xml:space="preserve">17</w:t>
+      </w:r>
+      <w:r>
+        <w:t xml:space="preserve"> </w:t>
+      </w:r>
+      <w:r>
+        <w:t xml:space="preserve">have surviving mutants, and those are where RQ1 and RQ4 can be answered at all.</w:t>
+      </w:r>
+      <w:r>
+        <w:t xml:space="preserve"> </w:t>
+      </w:r>
+      <w:r>
+        <w:t xml:space="preserve">The richest are</w:t>
+      </w:r>
+      <w:r>
+        <w:t xml:space="preserve"> </w:t>
+      </w:r>
+      <w:r>
+        <w:rPr>
+          <w:rStyle w:val="VerbatimChar"/>
+        </w:rPr>
+        <w:t xml:space="preserve">function_11</w:t>
+      </w:r>
+      <w:r>
+        <w:t xml:space="preserve"> </w:t>
+      </w:r>
+      <w:r>
+        <w:t xml:space="preserve">(74.1%),</w:t>
+      </w:r>
+      <w:r>
+        <w:t xml:space="preserve"> </w:t>
+      </w:r>
+      <w:r>
+        <w:rPr>
+          <w:rStyle w:val="VerbatimChar"/>
+        </w:rPr>
+        <w:t xml:space="preserve">function_19</w:t>
+      </w:r>
+      <w:r>
+        <w:t xml:space="preserve"> </w:t>
+      </w:r>
+      <w:r>
+        <w:t xml:space="preserve">(76.8%) and</w:t>
+      </w:r>
+      <w:r>
+        <w:t xml:space="preserve"> </w:t>
+      </w:r>
+      <w:r>
+        <w:rPr>
+          <w:rStyle w:val="VerbatimChar"/>
+        </w:rPr>
+        <w:t xml:space="preserve">function_04</w:t>
+      </w:r>
+      <w:r>
+        <w:t xml:space="preserve"> </w:t>
+      </w:r>
+      <w:r>
+        <w:t xml:space="preserve">(85.7%).</w:t>
+      </w:r>
+    </w:p>
+    <w:p>
+      <w:pPr>
+        <w:pStyle w:val="BodyText"/>
+      </w:pPr>
+      <w:r>
+        <w:t xml:space="preserve">This is also the argument against a stronger model for the main experiment: one</w:t>
+      </w:r>
+      <w:r>
+        <w:t xml:space="preserve"> </w:t>
+      </w:r>
+      <w:r>
+        <w:t xml:space="preserve">that kills more mutants leaves less for the loop to demonstrate.</w:t>
+      </w:r>
+    </w:p>
+    <w:bookmarkEnd w:id="12"/>
+    <w:bookmarkEnd w:id="13"/>
+    <w:bookmarkStart w:id="14" w:name="X898d68345b809d28960818b921d259c95d24473"/>
     <w:p>
       <w:pPr>
         <w:pStyle w:val="Heading2"/>
@@ -907,8 +1297,8 @@
         </w:tc>
       </w:tr>
     </w:tbl>
-    <w:bookmarkEnd w:id="12"/>
-    <w:bookmarkStart w:id="13" w:name="infrastructure-added"/>
+    <w:bookmarkEnd w:id="14"/>
+    <w:bookmarkStart w:id="15" w:name="infrastructure-added"/>
     <w:p>
       <w:pPr>
         <w:pStyle w:val="Heading2"/>
@@ -1041,8 +1431,8 @@
         <w:t xml:space="preserve">; the client parses and honours it rather than guessing a fixed backoff. Baseline B fires 5 calls back to back and paid tiers have per-minute caps, so this matters beyond the free tier.</w:t>
       </w:r>
     </w:p>
-    <w:bookmarkEnd w:id="13"/>
-    <w:bookmarkStart w:id="14" w:name="blocked"/>
+    <w:bookmarkEnd w:id="15"/>
+    <w:bookmarkStart w:id="16" w:name="blocked"/>
     <w:p>
       <w:pPr>
         <w:pStyle w:val="Heading2"/>
@@ -1277,8 +1667,8 @@
         <w:t xml:space="preserve">of CANDOR, not a reimplementation</w:t>
       </w:r>
     </w:p>
-    <w:bookmarkEnd w:id="14"/>
-    <w:bookmarkStart w:id="15" w:name="reproducing"/>
+    <w:bookmarkEnd w:id="16"/>
+    <w:bookmarkStart w:id="17" w:name="reproducing"/>
     <w:p>
       <w:pPr>
         <w:pStyle w:val="Heading2"/>
@@ -1438,7 +1828,7 @@
         <w:t xml:space="preserve">repository root.</w:t>
       </w:r>
     </w:p>
-    <w:bookmarkEnd w:id="15"/>
+    <w:bookmarkEnd w:id="17"/>
     <w:sectPr>
       <w:footnotePr>
         <w:numRestart w:val="eachSect"/>

</xml_diff>